<commit_message>
more changes and including emailing functionality
</commit_message>
<xml_diff>
--- a/AUTOMATION_FLOW.docx
+++ b/AUTOMATION_FLOW.docx
@@ -196,7 +196,7 @@
     </w:p>
     <w:p>
       <w:r>
-        <w:t xml:space="preserve">  - creates text logs, handover Excel reports, and email notifications</w:t>
+        <w:t xml:space="preserve">  - creates text logs, handover Excel reports, email notifications, and FTP drop-offs for the handover report</w:t>
       </w:r>
     </w:p>
     <w:p/>
@@ -329,7 +329,7 @@
     </w:p>
     <w:p>
       <w:r>
-        <w:t xml:space="preserve">  - GET-after-update verification, logs, verification workbooks, handover report email</w:t>
+        <w:t xml:space="preserve">  - GET-after-update verification, logs, verification workbooks, handover report email, and handover report FTP upload</w:t>
       </w:r>
     </w:p>
     <w:p/>
@@ -1448,6 +1448,18 @@
     </w:p>
     <w:p/>
     <w:p>
+      <w:r>
+        <w:t xml:space="preserve">After a successful email send, the same report is uploaded to FTP into:</w:t>
+      </w:r>
+    </w:p>
+    <w:p/>
+    <w:p>
+      <w:r>
+        <w:t xml:space="preserve">• `Matter Ref Updates`</w:t>
+      </w:r>
+    </w:p>
+    <w:p/>
+    <w:p>
       <w:pPr>
         <w:pStyle w:val="Heading3"/>
       </w:pPr>
@@ -1992,6 +2004,11 @@
         <w:t xml:space="preserve">• handover report email with attachment</w:t>
       </w:r>
     </w:p>
+    <w:p>
+      <w:r>
+        <w:t xml:space="preserve">• handover report FTP upload to `Matter Ref Updates`</w:t>
+      </w:r>
+    </w:p>
     <w:p/>
     <w:p>
       <w:pPr>
@@ -2198,6 +2215,11 @@
     <w:p>
       <w:r>
         <w:t xml:space="preserve">8. Send handover report email when relevant</w:t>
+      </w:r>
+    </w:p>
+    <w:p>
+      <w:r>
+        <w:t xml:space="preserve">9. Upload the handover report to FTP when the email send succeeds</w:t>
       </w:r>
     </w:p>
     <w:p/>

</xml_diff>

<commit_message>
more updating the fixing id number now reflecting on legal suite frontend
</commit_message>
<xml_diff>
--- a/AUTOMATION_FLOW.docx
+++ b/AUTOMATION_FLOW.docx
@@ -581,6 +581,11 @@
     </w:p>
     <w:p>
       <w:r>
+        <w:t xml:space="preserve">• `ID Number` -&gt; `party[parlang][identitynumber]`</w:t>
+      </w:r>
+    </w:p>
+    <w:p>
+      <w:r>
         <w:t xml:space="preserve">• physical address lines -&gt; party physical address fields</w:t>
       </w:r>
     </w:p>
@@ -601,6 +606,50 @@
     </w:p>
     <w:p/>
     <w:p>
+      <w:r>
+        <w:t xml:space="preserve">After the party create or party reuse step, the automation now performs an explicit `ParLang` maintenance step:</w:t>
+      </w:r>
+    </w:p>
+    <w:p/>
+    <w:p>
+      <w:r>
+        <w:t xml:space="preserve">• `parlang/get` by `PartyID` and `LanguageID = 1`</w:t>
+      </w:r>
+    </w:p>
+    <w:p>
+      <w:r>
+        <w:t xml:space="preserve">• `parlang/update` by `RecordID`, `PartyID`, and `LanguageID`</w:t>
+      </w:r>
+    </w:p>
+    <w:p/>
+    <w:p>
+      <w:r>
+        <w:t xml:space="preserve">The current explicit `ParLang` update writes:</w:t>
+      </w:r>
+    </w:p>
+    <w:p/>
+    <w:p>
+      <w:r>
+        <w:t xml:space="preserve">• `identitynumber` from `ID Number`</w:t>
+      </w:r>
+    </w:p>
+    <w:p>
+      <w:r>
+        <w:t xml:space="preserve">• `firstname` from `Debtor First Name`</w:t>
+      </w:r>
+    </w:p>
+    <w:p>
+      <w:r>
+        <w:t xml:space="preserve">• `title` from `Debtor Title`</w:t>
+      </w:r>
+    </w:p>
+    <w:p>
+      <w:r>
+        <w:t xml:space="preserve">• `birthdate` when a supported birthdate column exists in the source row</w:t>
+      </w:r>
+    </w:p>
+    <w:p/>
+    <w:p>
       <w:pPr>
         <w:pStyle w:val="Heading3"/>
       </w:pPr>
@@ -1393,12 +1442,17 @@
     </w:p>
     <w:p>
       <w:r>
-        <w:t xml:space="preserve">8. create or reuse the MatParty link between the matter and party</w:t>
-      </w:r>
-    </w:p>
-    <w:p>
-      <w:r>
-        <w:t xml:space="preserve">9. update Desktop Extra Screen data for the new or matched matter when handover extrascreen values exist</w:t>
+        <w:t xml:space="preserve">8. explicitly update the related `ParLang` row for language `1`</w:t>
+      </w:r>
+    </w:p>
+    <w:p>
+      <w:r>
+        <w:t xml:space="preserve">9. create or reuse the MatParty link between the matter and party</w:t>
+      </w:r>
+    </w:p>
+    <w:p>
+      <w:r>
+        <w:t xml:space="preserve">10. update Desktop Extra Screen data for the new or matched matter when handover extrascreen values exist</w:t>
       </w:r>
     </w:p>
     <w:p/>

</xml_diff>